<commit_message>
Ficheiros da Fase Alfa atualizados
</commit_message>
<xml_diff>
--- a/apresentacoes/alfa-pitch/Fase_ALFA.docx
+++ b/apresentacoes/alfa-pitch/Fase_ALFA.docx
@@ -48,8 +48,26 @@
           <w:szCs w:val="28"/>
           <w:lang w:val="pt-PT"/>
         </w:rPr>
-        <w:t>Equipa: WebInnovators</w:t>
+        <w:t xml:space="preserve">Equipa: </w:t>
       </w:r>
+      <w:proofErr w:type="spellStart"/>
+      <w:r>
+        <w:rPr>
+          <w:sz w:val="28"/>
+          <w:szCs w:val="28"/>
+          <w:lang w:val="pt-PT"/>
+        </w:rPr>
+        <w:t>Web</w:t>
+      </w:r>
+      <w:r>
+        <w:rPr>
+          <w:sz w:val="28"/>
+          <w:szCs w:val="28"/>
+          <w:lang w:val="pt-PT"/>
+        </w:rPr>
+        <w:t>Weavers</w:t>
+      </w:r>
+      <w:proofErr w:type="spellEnd"/>
     </w:p>
     <w:p>
       <w:pPr>
@@ -2614,6 +2632,490 @@
       </w:tr>
     </w:tbl>
     <w:p/>
+    <w:p>
+      <w:pPr>
+        <w:numPr>
+          <w:ilvl w:val="0"/>
+          <w:numId w:val="10"/>
+        </w:numPr>
+        <w:rPr>
+          <w:lang w:val="pt-PT"/>
+        </w:rPr>
+      </w:pPr>
+      <w:r>
+        <w:rPr>
+          <w:lang w:val="pt-PT"/>
+        </w:rPr>
+        <w:lastRenderedPageBreak/>
+        <w:t xml:space="preserve">Integração com Google </w:t>
+      </w:r>
+      <w:proofErr w:type="spellStart"/>
+      <w:r>
+        <w:rPr>
+          <w:lang w:val="pt-PT"/>
+        </w:rPr>
+        <w:t>Maps</w:t>
+      </w:r>
+      <w:proofErr w:type="spellEnd"/>
+      <w:r>
+        <w:rPr>
+          <w:lang w:val="pt-PT"/>
+        </w:rPr>
+        <w:t>:</w:t>
+      </w:r>
+    </w:p>
+    <w:p>
+      <w:pPr>
+        <w:ind w:left="720"/>
+        <w:rPr>
+          <w:lang w:val="pt-PT"/>
+        </w:rPr>
+      </w:pPr>
+      <w:r>
+        <w:rPr>
+          <w:lang w:val="pt-PT"/>
+        </w:rPr>
+        <w:t xml:space="preserve">- </w:t>
+      </w:r>
+      <w:r>
+        <w:rPr>
+          <w:lang w:val="pt-PT"/>
+        </w:rPr>
+        <w:t>Implementar marcação de zonas de intervenção no mapa (polígonos georreferenciados).</w:t>
+      </w:r>
+    </w:p>
+    <w:p>
+      <w:pPr>
+        <w:ind w:left="720"/>
+        <w:rPr>
+          <w:lang w:val="pt-PT"/>
+        </w:rPr>
+      </w:pPr>
+      <w:r>
+        <w:rPr>
+          <w:lang w:val="pt-PT"/>
+        </w:rPr>
+        <w:t xml:space="preserve">- </w:t>
+      </w:r>
+      <w:r>
+        <w:rPr>
+          <w:lang w:val="pt-PT"/>
+        </w:rPr>
+        <w:t>Adicionar funcionalidade de visualização de eventos/caminhadas em tempo real no mapa.</w:t>
+      </w:r>
+    </w:p>
+    <w:p>
+      <w:pPr>
+        <w:ind w:left="720"/>
+        <w:rPr>
+          <w:lang w:val="pt-PT"/>
+        </w:rPr>
+      </w:pPr>
+      <w:r>
+        <w:rPr>
+          <w:lang w:val="pt-PT"/>
+        </w:rPr>
+        <w:t xml:space="preserve">- </w:t>
+      </w:r>
+      <w:r>
+        <w:rPr>
+          <w:lang w:val="pt-PT"/>
+        </w:rPr>
+        <w:t xml:space="preserve">Permitir que usuários </w:t>
+      </w:r>
+      <w:proofErr w:type="gramStart"/>
+      <w:r>
+        <w:rPr>
+          <w:lang w:val="pt-PT"/>
+        </w:rPr>
+        <w:t>registrem</w:t>
+      </w:r>
+      <w:proofErr w:type="gramEnd"/>
+      <w:r>
+        <w:rPr>
+          <w:lang w:val="pt-PT"/>
+        </w:rPr>
+        <w:t xml:space="preserve"> sugestões de intervenção diretamente no mapa (ex.: clicar em uma área e enviar proposta).</w:t>
+      </w:r>
+    </w:p>
+    <w:p>
+      <w:pPr>
+        <w:numPr>
+          <w:ilvl w:val="0"/>
+          <w:numId w:val="10"/>
+        </w:numPr>
+        <w:rPr>
+          <w:lang w:val="pt-PT"/>
+        </w:rPr>
+      </w:pPr>
+      <w:r>
+        <w:rPr>
+          <w:lang w:val="pt-PT"/>
+        </w:rPr>
+        <w:t xml:space="preserve">Criar um sistema de pontos/badges para </w:t>
+      </w:r>
+      <w:r>
+        <w:rPr>
+          <w:lang w:val="pt-PT"/>
+        </w:rPr>
+        <w:t>utilizadores</w:t>
+      </w:r>
+      <w:r>
+        <w:rPr>
+          <w:lang w:val="pt-PT"/>
+        </w:rPr>
+        <w:t xml:space="preserve"> que participam </w:t>
+      </w:r>
+      <w:r>
+        <w:rPr>
+          <w:lang w:val="pt-PT"/>
+        </w:rPr>
+        <w:t>em</w:t>
+      </w:r>
+      <w:r>
+        <w:rPr>
+          <w:lang w:val="pt-PT"/>
+        </w:rPr>
+        <w:t xml:space="preserve"> eventos, sugerem intervenções ou interagem com o sistema</w:t>
+      </w:r>
+      <w:r>
+        <w:rPr>
+          <w:lang w:val="pt-PT"/>
+        </w:rPr>
+        <w:t>, a</w:t>
+      </w:r>
+      <w:r>
+        <w:rPr>
+          <w:lang w:val="pt-PT"/>
+        </w:rPr>
+        <w:t>dicionar um</w:t>
+      </w:r>
+      <w:r>
+        <w:rPr>
+          <w:lang w:val="pt-PT"/>
+        </w:rPr>
+        <w:t>a aba</w:t>
+      </w:r>
+      <w:r>
+        <w:rPr>
+          <w:lang w:val="pt-PT"/>
+        </w:rPr>
+        <w:t xml:space="preserve"> no perfil do </w:t>
+      </w:r>
+      <w:r>
+        <w:rPr>
+          <w:lang w:val="pt-PT"/>
+        </w:rPr>
+        <w:t>utilizador</w:t>
+      </w:r>
+      <w:r>
+        <w:rPr>
+          <w:lang w:val="pt-PT"/>
+        </w:rPr>
+        <w:t xml:space="preserve"> para destacar contribuições.</w:t>
+      </w:r>
+    </w:p>
+    <w:p>
+      <w:pPr>
+        <w:numPr>
+          <w:ilvl w:val="0"/>
+          <w:numId w:val="10"/>
+        </w:numPr>
+        <w:rPr>
+          <w:lang w:val="pt-PT"/>
+        </w:rPr>
+      </w:pPr>
+      <w:r>
+        <w:rPr>
+          <w:lang w:val="pt-PT"/>
+        </w:rPr>
+        <w:t>Relatórios e Monitoramento:</w:t>
+      </w:r>
+    </w:p>
+    <w:p>
+      <w:pPr>
+        <w:ind w:left="720"/>
+        <w:rPr>
+          <w:lang w:val="pt-PT"/>
+        </w:rPr>
+      </w:pPr>
+      <w:r>
+        <w:rPr>
+          <w:lang w:val="pt-PT"/>
+        </w:rPr>
+        <w:t xml:space="preserve">- </w:t>
+      </w:r>
+      <w:r>
+        <w:rPr>
+          <w:lang w:val="pt-PT"/>
+        </w:rPr>
+        <w:t xml:space="preserve">Gerar relatórios automáticos sobre o progresso das intervenções (ex.: </w:t>
+      </w:r>
+      <w:r>
+        <w:rPr>
+          <w:lang w:val="pt-PT"/>
+        </w:rPr>
+        <w:t>percentagem</w:t>
+      </w:r>
+      <w:r>
+        <w:rPr>
+          <w:lang w:val="pt-PT"/>
+        </w:rPr>
+        <w:t>, custos estimados).</w:t>
+      </w:r>
+    </w:p>
+    <w:p>
+      <w:pPr>
+        <w:ind w:left="720"/>
+        <w:rPr>
+          <w:lang w:val="pt-PT"/>
+        </w:rPr>
+      </w:pPr>
+      <w:r>
+        <w:rPr>
+          <w:lang w:val="pt-PT"/>
+        </w:rPr>
+        <w:t xml:space="preserve">- </w:t>
+      </w:r>
+      <w:r>
+        <w:rPr>
+          <w:lang w:val="pt-PT"/>
+        </w:rPr>
+        <w:t>Notificações para atualizações de obras.</w:t>
+      </w:r>
+    </w:p>
+    <w:p>
+      <w:pPr>
+        <w:ind w:left="720"/>
+        <w:rPr>
+          <w:lang w:val="pt-PT"/>
+        </w:rPr>
+      </w:pPr>
+    </w:p>
+    <w:p>
+      <w:pPr>
+        <w:numPr>
+          <w:ilvl w:val="0"/>
+          <w:numId w:val="10"/>
+        </w:numPr>
+        <w:rPr>
+          <w:lang w:val="pt-PT"/>
+        </w:rPr>
+      </w:pPr>
+      <w:r>
+        <w:rPr>
+          <w:b/>
+          <w:bCs/>
+          <w:lang w:val="pt-PT"/>
+        </w:rPr>
+        <w:t>Possíveis Operações</w:t>
+      </w:r>
+      <w:r>
+        <w:rPr>
+          <w:lang w:val="pt-PT"/>
+        </w:rPr>
+        <w:t>:</w:t>
+      </w:r>
+    </w:p>
+    <w:p>
+      <w:pPr>
+        <w:numPr>
+          <w:ilvl w:val="1"/>
+          <w:numId w:val="10"/>
+        </w:numPr>
+        <w:rPr>
+          <w:lang w:val="pt-PT"/>
+        </w:rPr>
+      </w:pPr>
+      <w:r>
+        <w:rPr>
+          <w:lang w:val="pt-PT"/>
+        </w:rPr>
+        <w:t>H-OP</w:t>
+      </w:r>
+      <w:r>
+        <w:rPr>
+          <w:lang w:val="pt-PT"/>
+        </w:rPr>
+        <w:t>17</w:t>
+      </w:r>
+      <w:r>
+        <w:rPr>
+          <w:lang w:val="pt-PT"/>
+        </w:rPr>
+        <w:t>: Sistema de votação para priorizar intervenções</w:t>
+      </w:r>
+    </w:p>
+    <w:p>
+      <w:pPr>
+        <w:numPr>
+          <w:ilvl w:val="1"/>
+          <w:numId w:val="10"/>
+        </w:numPr>
+        <w:rPr>
+          <w:lang w:val="pt-PT"/>
+        </w:rPr>
+      </w:pPr>
+      <w:r>
+        <w:rPr>
+          <w:lang w:val="pt-PT"/>
+        </w:rPr>
+        <w:t>H-OP</w:t>
+      </w:r>
+      <w:r>
+        <w:rPr>
+          <w:lang w:val="pt-PT"/>
+        </w:rPr>
+        <w:t>18</w:t>
+      </w:r>
+      <w:r>
+        <w:rPr>
+          <w:lang w:val="pt-PT"/>
+        </w:rPr>
+        <w:t xml:space="preserve">: Agendamento de visitas guiadas com </w:t>
+      </w:r>
+      <w:proofErr w:type="spellStart"/>
+      <w:r>
+        <w:rPr>
+          <w:lang w:val="pt-PT"/>
+        </w:rPr>
+        <w:t>geolocalização</w:t>
+      </w:r>
+      <w:proofErr w:type="spellEnd"/>
+      <w:r>
+        <w:rPr>
+          <w:lang w:val="pt-PT"/>
+        </w:rPr>
+        <w:t xml:space="preserve"> e check-in via QR </w:t>
+      </w:r>
+      <w:proofErr w:type="spellStart"/>
+      <w:r>
+        <w:rPr>
+          <w:lang w:val="pt-PT"/>
+        </w:rPr>
+        <w:t>code</w:t>
+      </w:r>
+      <w:proofErr w:type="spellEnd"/>
+      <w:r>
+        <w:rPr>
+          <w:lang w:val="pt-PT"/>
+        </w:rPr>
+        <w:t>.</w:t>
+      </w:r>
+    </w:p>
+    <w:p>
+      <w:pPr>
+        <w:numPr>
+          <w:ilvl w:val="1"/>
+          <w:numId w:val="10"/>
+        </w:numPr>
+        <w:rPr>
+          <w:lang w:val="pt-PT"/>
+        </w:rPr>
+      </w:pPr>
+      <w:r>
+        <w:rPr>
+          <w:lang w:val="pt-PT"/>
+        </w:rPr>
+        <w:t>H-OP</w:t>
+      </w:r>
+      <w:r>
+        <w:rPr>
+          <w:lang w:val="pt-PT"/>
+        </w:rPr>
+        <w:t>19</w:t>
+      </w:r>
+      <w:r>
+        <w:rPr>
+          <w:lang w:val="pt-PT"/>
+        </w:rPr>
+        <w:t xml:space="preserve">: </w:t>
+      </w:r>
+      <w:proofErr w:type="spellStart"/>
+      <w:r>
+        <w:rPr>
+          <w:lang w:val="pt-PT"/>
+        </w:rPr>
+        <w:t>Feed</w:t>
+      </w:r>
+      <w:proofErr w:type="spellEnd"/>
+      <w:r>
+        <w:rPr>
+          <w:lang w:val="pt-PT"/>
+        </w:rPr>
+        <w:t xml:space="preserve"> de notícias públicas sobre transformações territoriais.</w:t>
+      </w:r>
+    </w:p>
+    <w:p>
+      <w:pPr>
+        <w:rPr>
+          <w:lang w:val="pt-PT"/>
+        </w:rPr>
+      </w:pPr>
+    </w:p>
+    <w:p>
+      <w:pPr>
+        <w:rPr>
+          <w:lang w:val="pt-PT"/>
+        </w:rPr>
+      </w:pPr>
+    </w:p>
+    <w:p>
+      <w:pPr>
+        <w:rPr>
+          <w:lang w:val="pt-PT"/>
+        </w:rPr>
+      </w:pPr>
+    </w:p>
+    <w:p>
+      <w:pPr>
+        <w:rPr>
+          <w:lang w:val="pt-PT"/>
+        </w:rPr>
+      </w:pPr>
+    </w:p>
+    <w:p>
+      <w:pPr>
+        <w:rPr>
+          <w:lang w:val="pt-PT"/>
+        </w:rPr>
+      </w:pPr>
+    </w:p>
+    <w:p>
+      <w:pPr>
+        <w:rPr>
+          <w:lang w:val="pt-PT"/>
+        </w:rPr>
+      </w:pPr>
+    </w:p>
+    <w:p>
+      <w:pPr>
+        <w:rPr>
+          <w:lang w:val="pt-PT"/>
+        </w:rPr>
+      </w:pPr>
+    </w:p>
+    <w:p>
+      <w:pPr>
+        <w:rPr>
+          <w:lang w:val="pt-PT"/>
+        </w:rPr>
+      </w:pPr>
+    </w:p>
+    <w:p>
+      <w:pPr>
+        <w:rPr>
+          <w:lang w:val="pt-PT"/>
+        </w:rPr>
+      </w:pPr>
+    </w:p>
+    <w:p>
+      <w:pPr>
+        <w:rPr>
+          <w:lang w:val="pt-PT"/>
+        </w:rPr>
+      </w:pPr>
+    </w:p>
     <w:p>
       <w:r>
         <w:lastRenderedPageBreak/>
@@ -2684,7 +3186,6 @@
     <w:p>
       <w:pPr>
         <w:rPr>
-          <w:u w:val="single"/>
           <w:lang w:val="pt-PT"/>
         </w:rPr>
       </w:pPr>
@@ -2755,6 +3256,977 @@
         <w:t>ink do site/app e contacto)</w:t>
       </w:r>
     </w:p>
+    <w:p>
+      <w:pPr>
+        <w:jc w:val="center"/>
+        <w:rPr>
+          <w:b/>
+          <w:bCs/>
+          <w:sz w:val="28"/>
+          <w:szCs w:val="28"/>
+          <w:lang w:val="pt-PT"/>
+        </w:rPr>
+      </w:pPr>
+      <w:r>
+        <w:rPr>
+          <w:b/>
+          <w:bCs/>
+          <w:sz w:val="28"/>
+          <w:szCs w:val="28"/>
+          <w:lang w:val="pt-PT"/>
+        </w:rPr>
+        <w:lastRenderedPageBreak/>
+        <w:t>Apresentação</w:t>
+      </w:r>
+    </w:p>
+    <w:p>
+      <w:pPr>
+        <w:rPr>
+          <w:b/>
+          <w:bCs/>
+          <w:sz w:val="20"/>
+          <w:szCs w:val="20"/>
+          <w:u w:val="single"/>
+          <w:lang w:val="pt-PT"/>
+        </w:rPr>
+      </w:pPr>
+      <w:r>
+        <w:rPr>
+          <w:b/>
+          <w:bCs/>
+          <w:sz w:val="20"/>
+          <w:szCs w:val="20"/>
+          <w:u w:val="single"/>
+          <w:lang w:val="pt-PT"/>
+        </w:rPr>
+        <w:t>Slide 1: Capa</w:t>
+      </w:r>
+    </w:p>
+    <w:p>
+      <w:pPr>
+        <w:numPr>
+          <w:ilvl w:val="0"/>
+          <w:numId w:val="11"/>
+        </w:numPr>
+        <w:rPr>
+          <w:sz w:val="20"/>
+          <w:szCs w:val="20"/>
+          <w:lang w:val="pt-PT"/>
+        </w:rPr>
+      </w:pPr>
+      <w:r>
+        <w:rPr>
+          <w:sz w:val="20"/>
+          <w:szCs w:val="20"/>
+          <w:lang w:val="pt-PT"/>
+        </w:rPr>
+        <w:t xml:space="preserve">Título: </w:t>
+      </w:r>
+      <w:proofErr w:type="spellStart"/>
+      <w:r>
+        <w:rPr>
+          <w:sz w:val="20"/>
+          <w:szCs w:val="20"/>
+          <w:lang w:val="pt-PT"/>
+        </w:rPr>
+        <w:t>LandWise</w:t>
+      </w:r>
+      <w:proofErr w:type="spellEnd"/>
+      <w:r>
+        <w:rPr>
+          <w:sz w:val="20"/>
+          <w:szCs w:val="20"/>
+          <w:lang w:val="pt-PT"/>
+        </w:rPr>
+        <w:t xml:space="preserve"> / </w:t>
+      </w:r>
+      <w:r>
+        <w:rPr>
+          <w:sz w:val="20"/>
+          <w:szCs w:val="20"/>
+          <w:lang w:val="pt-PT"/>
+        </w:rPr>
+        <w:t xml:space="preserve">Equipa: </w:t>
+      </w:r>
+      <w:proofErr w:type="spellStart"/>
+      <w:r>
+        <w:rPr>
+          <w:sz w:val="20"/>
+          <w:szCs w:val="20"/>
+          <w:lang w:val="pt-PT"/>
+        </w:rPr>
+        <w:t>Web</w:t>
+      </w:r>
+      <w:r>
+        <w:rPr>
+          <w:sz w:val="20"/>
+          <w:szCs w:val="20"/>
+          <w:lang w:val="pt-PT"/>
+        </w:rPr>
+        <w:t>Weavers</w:t>
+      </w:r>
+      <w:proofErr w:type="spellEnd"/>
+    </w:p>
+    <w:p>
+      <w:pPr>
+        <w:numPr>
+          <w:ilvl w:val="0"/>
+          <w:numId w:val="11"/>
+        </w:numPr>
+        <w:rPr>
+          <w:sz w:val="20"/>
+          <w:szCs w:val="20"/>
+          <w:lang w:val="pt-PT"/>
+        </w:rPr>
+      </w:pPr>
+      <w:r>
+        <w:rPr>
+          <w:sz w:val="20"/>
+          <w:szCs w:val="20"/>
+          <w:lang w:val="pt-PT"/>
+        </w:rPr>
+        <w:t>Logo + Imagem de fundo relacionada a mapas/intervenções.</w:t>
+      </w:r>
+    </w:p>
+    <w:p>
+      <w:pPr>
+        <w:rPr>
+          <w:b/>
+          <w:bCs/>
+          <w:sz w:val="20"/>
+          <w:szCs w:val="20"/>
+          <w:u w:val="single"/>
+          <w:lang w:val="pt-PT"/>
+        </w:rPr>
+      </w:pPr>
+      <w:r>
+        <w:rPr>
+          <w:b/>
+          <w:bCs/>
+          <w:sz w:val="20"/>
+          <w:szCs w:val="20"/>
+          <w:u w:val="single"/>
+          <w:lang w:val="pt-PT"/>
+        </w:rPr>
+        <w:t>Slide 2: Quem Somos</w:t>
+      </w:r>
+    </w:p>
+    <w:p>
+      <w:pPr>
+        <w:numPr>
+          <w:ilvl w:val="0"/>
+          <w:numId w:val="12"/>
+        </w:numPr>
+        <w:rPr>
+          <w:b/>
+          <w:bCs/>
+          <w:sz w:val="20"/>
+          <w:szCs w:val="20"/>
+          <w:u w:val="single"/>
+          <w:lang w:val="pt-PT"/>
+        </w:rPr>
+      </w:pPr>
+      <w:r>
+        <w:rPr>
+          <w:sz w:val="20"/>
+          <w:szCs w:val="20"/>
+          <w:lang w:val="pt-PT"/>
+        </w:rPr>
+        <w:t xml:space="preserve">Nomes + </w:t>
+      </w:r>
+      <w:proofErr w:type="gramStart"/>
+      <w:r>
+        <w:rPr>
+          <w:sz w:val="20"/>
+          <w:szCs w:val="20"/>
+          <w:lang w:val="pt-PT"/>
+        </w:rPr>
+        <w:t>funções</w:t>
+      </w:r>
+      <w:r>
+        <w:rPr>
+          <w:sz w:val="20"/>
+          <w:szCs w:val="20"/>
+          <w:lang w:val="pt-PT"/>
+        </w:rPr>
+        <w:t xml:space="preserve"> </w:t>
+      </w:r>
+      <w:r>
+        <w:rPr>
+          <w:sz w:val="20"/>
+          <w:szCs w:val="20"/>
+          <w:lang w:val="pt-PT"/>
+        </w:rPr>
+        <w:t xml:space="preserve"> (</w:t>
+      </w:r>
+      <w:proofErr w:type="spellStart"/>
+      <w:proofErr w:type="gramEnd"/>
+      <w:r>
+        <w:rPr>
+          <w:sz w:val="20"/>
+          <w:szCs w:val="20"/>
+          <w:lang w:val="pt-PT"/>
+        </w:rPr>
+        <w:t>ex</w:t>
+      </w:r>
+      <w:proofErr w:type="spellEnd"/>
+      <w:r>
+        <w:rPr>
+          <w:sz w:val="20"/>
+          <w:szCs w:val="20"/>
+          <w:lang w:val="pt-PT"/>
+        </w:rPr>
+        <w:t xml:space="preserve">: </w:t>
+      </w:r>
+      <w:proofErr w:type="spellStart"/>
+      <w:r>
+        <w:rPr>
+          <w:sz w:val="20"/>
+          <w:szCs w:val="20"/>
+          <w:lang w:val="pt-PT"/>
+        </w:rPr>
+        <w:t>Backend</w:t>
+      </w:r>
+      <w:proofErr w:type="spellEnd"/>
+      <w:r>
+        <w:rPr>
+          <w:sz w:val="20"/>
+          <w:szCs w:val="20"/>
+          <w:lang w:val="pt-PT"/>
+        </w:rPr>
+        <w:t xml:space="preserve">, </w:t>
+      </w:r>
+      <w:proofErr w:type="spellStart"/>
+      <w:r>
+        <w:rPr>
+          <w:sz w:val="20"/>
+          <w:szCs w:val="20"/>
+          <w:lang w:val="pt-PT"/>
+        </w:rPr>
+        <w:t>Frontend</w:t>
+      </w:r>
+      <w:proofErr w:type="spellEnd"/>
+      <w:r>
+        <w:rPr>
+          <w:sz w:val="20"/>
+          <w:szCs w:val="20"/>
+          <w:lang w:val="pt-PT"/>
+        </w:rPr>
+        <w:t xml:space="preserve"> Mobile, </w:t>
+      </w:r>
+      <w:proofErr w:type="gramStart"/>
+      <w:r>
+        <w:rPr>
+          <w:sz w:val="20"/>
+          <w:szCs w:val="20"/>
+          <w:lang w:val="pt-PT"/>
+        </w:rPr>
+        <w:t>etc..</w:t>
+      </w:r>
+      <w:proofErr w:type="gramEnd"/>
+      <w:r>
+        <w:rPr>
+          <w:sz w:val="20"/>
+          <w:szCs w:val="20"/>
+          <w:lang w:val="pt-PT"/>
+        </w:rPr>
+        <w:t>)</w:t>
+      </w:r>
+    </w:p>
+    <w:p>
+      <w:pPr>
+        <w:numPr>
+          <w:ilvl w:val="0"/>
+          <w:numId w:val="12"/>
+        </w:numPr>
+        <w:rPr>
+          <w:sz w:val="20"/>
+          <w:szCs w:val="20"/>
+          <w:lang w:val="pt-PT"/>
+        </w:rPr>
+      </w:pPr>
+      <w:r>
+        <w:rPr>
+          <w:sz w:val="20"/>
+          <w:szCs w:val="20"/>
+          <w:lang w:val="pt-PT"/>
+        </w:rPr>
+        <w:t>Logo da Equipa + frase inspiradora (</w:t>
+      </w:r>
+      <w:proofErr w:type="spellStart"/>
+      <w:r>
+        <w:rPr>
+          <w:sz w:val="20"/>
+          <w:szCs w:val="20"/>
+          <w:lang w:val="pt-PT"/>
+        </w:rPr>
+        <w:t>ex</w:t>
+      </w:r>
+      <w:proofErr w:type="spellEnd"/>
+      <w:r>
+        <w:rPr>
+          <w:sz w:val="20"/>
+          <w:szCs w:val="20"/>
+          <w:lang w:val="pt-PT"/>
+        </w:rPr>
+        <w:t>: Ordenamento Inteligente, Gestão Participativa.</w:t>
+      </w:r>
+      <w:r>
+        <w:rPr>
+          <w:sz w:val="20"/>
+          <w:szCs w:val="20"/>
+          <w:lang w:val="pt-PT"/>
+        </w:rPr>
+        <w:t>).</w:t>
+      </w:r>
+    </w:p>
+    <w:p>
+      <w:pPr>
+        <w:rPr>
+          <w:b/>
+          <w:bCs/>
+          <w:sz w:val="20"/>
+          <w:szCs w:val="20"/>
+          <w:u w:val="single"/>
+          <w:lang w:val="pt-PT"/>
+        </w:rPr>
+      </w:pPr>
+      <w:r>
+        <w:rPr>
+          <w:b/>
+          <w:bCs/>
+          <w:sz w:val="20"/>
+          <w:szCs w:val="20"/>
+          <w:u w:val="single"/>
+          <w:lang w:val="pt-PT"/>
+        </w:rPr>
+        <w:t>Slide 3: Visão do Produto</w:t>
+      </w:r>
+    </w:p>
+    <w:p>
+      <w:pPr>
+        <w:numPr>
+          <w:ilvl w:val="0"/>
+          <w:numId w:val="13"/>
+        </w:numPr>
+        <w:rPr>
+          <w:sz w:val="20"/>
+          <w:szCs w:val="20"/>
+          <w:lang w:val="pt-PT"/>
+        </w:rPr>
+      </w:pPr>
+      <w:r>
+        <w:rPr>
+          <w:sz w:val="20"/>
+          <w:szCs w:val="20"/>
+          <w:lang w:val="pt-PT"/>
+        </w:rPr>
+        <w:t xml:space="preserve">Frase-chave: </w:t>
+      </w:r>
+    </w:p>
+    <w:p>
+      <w:pPr>
+        <w:numPr>
+          <w:ilvl w:val="0"/>
+          <w:numId w:val="13"/>
+        </w:numPr>
+        <w:rPr>
+          <w:sz w:val="20"/>
+          <w:szCs w:val="20"/>
+          <w:lang w:val="pt-PT"/>
+        </w:rPr>
+      </w:pPr>
+      <w:r>
+        <w:rPr>
+          <w:sz w:val="20"/>
+          <w:szCs w:val="20"/>
+          <w:lang w:val="pt-PT"/>
+        </w:rPr>
+        <w:t xml:space="preserve">Objetivo: Facilitar a gestão de intervenções e promover a participação </w:t>
+      </w:r>
+      <w:r>
+        <w:rPr>
+          <w:sz w:val="20"/>
+          <w:szCs w:val="20"/>
+          <w:lang w:val="pt-PT"/>
+        </w:rPr>
+        <w:t>dos cidadãos</w:t>
+      </w:r>
+      <w:r>
+        <w:rPr>
+          <w:sz w:val="20"/>
+          <w:szCs w:val="20"/>
+          <w:lang w:val="pt-PT"/>
+        </w:rPr>
+        <w:t>.</w:t>
+      </w:r>
+    </w:p>
+    <w:p>
+      <w:pPr>
+        <w:numPr>
+          <w:ilvl w:val="0"/>
+          <w:numId w:val="13"/>
+        </w:numPr>
+        <w:rPr>
+          <w:sz w:val="20"/>
+          <w:szCs w:val="20"/>
+          <w:lang w:val="pt-PT"/>
+        </w:rPr>
+      </w:pPr>
+      <w:r>
+        <w:rPr>
+          <w:sz w:val="20"/>
+          <w:szCs w:val="20"/>
+          <w:lang w:val="pt-PT"/>
+        </w:rPr>
+        <w:t xml:space="preserve">Diferenciação: </w:t>
+      </w:r>
+      <w:proofErr w:type="spellStart"/>
+      <w:proofErr w:type="gramStart"/>
+      <w:r>
+        <w:rPr>
+          <w:sz w:val="20"/>
+          <w:szCs w:val="20"/>
+          <w:lang w:val="pt-PT"/>
+        </w:rPr>
+        <w:t>Gamificação</w:t>
+      </w:r>
+      <w:proofErr w:type="spellEnd"/>
+      <w:r>
+        <w:rPr>
+          <w:sz w:val="20"/>
+          <w:szCs w:val="20"/>
+          <w:lang w:val="pt-PT"/>
+        </w:rPr>
+        <w:t>(</w:t>
+      </w:r>
+      <w:proofErr w:type="gramEnd"/>
+      <w:r>
+        <w:rPr>
+          <w:sz w:val="20"/>
+          <w:szCs w:val="20"/>
+          <w:lang w:val="pt-PT"/>
+        </w:rPr>
+        <w:t>Sistema de pontos/badges)</w:t>
+      </w:r>
+      <w:r>
+        <w:rPr>
+          <w:sz w:val="20"/>
+          <w:szCs w:val="20"/>
+          <w:lang w:val="pt-PT"/>
+        </w:rPr>
+        <w:t xml:space="preserve"> + Integração com Google </w:t>
+      </w:r>
+      <w:proofErr w:type="spellStart"/>
+      <w:r>
+        <w:rPr>
+          <w:sz w:val="20"/>
+          <w:szCs w:val="20"/>
+          <w:lang w:val="pt-PT"/>
+        </w:rPr>
+        <w:t>Maps</w:t>
+      </w:r>
+      <w:proofErr w:type="spellEnd"/>
+      <w:r>
+        <w:rPr>
+          <w:sz w:val="20"/>
+          <w:szCs w:val="20"/>
+          <w:lang w:val="pt-PT"/>
+        </w:rPr>
+        <w:t xml:space="preserve"> em tempo real.</w:t>
+      </w:r>
+    </w:p>
+    <w:p>
+      <w:pPr>
+        <w:rPr>
+          <w:b/>
+          <w:bCs/>
+          <w:sz w:val="20"/>
+          <w:szCs w:val="20"/>
+          <w:u w:val="single"/>
+          <w:lang w:val="pt-PT"/>
+        </w:rPr>
+      </w:pPr>
+      <w:r>
+        <w:rPr>
+          <w:b/>
+          <w:bCs/>
+          <w:sz w:val="20"/>
+          <w:szCs w:val="20"/>
+          <w:u w:val="single"/>
+          <w:lang w:val="pt-PT"/>
+        </w:rPr>
+        <w:t>Slide 4: Funcionalidades-Chave</w:t>
+      </w:r>
+    </w:p>
+    <w:p>
+      <w:pPr>
+        <w:numPr>
+          <w:ilvl w:val="0"/>
+          <w:numId w:val="14"/>
+        </w:numPr>
+        <w:rPr>
+          <w:sz w:val="20"/>
+          <w:szCs w:val="20"/>
+          <w:lang w:val="pt-PT"/>
+        </w:rPr>
+      </w:pPr>
+      <w:r>
+        <w:rPr>
+          <w:sz w:val="20"/>
+          <w:szCs w:val="20"/>
+          <w:lang w:val="pt-PT"/>
+        </w:rPr>
+        <w:t>Gestão Institucional: Folhas de obra, relatórios, monitoramento.</w:t>
+      </w:r>
+    </w:p>
+    <w:p>
+      <w:pPr>
+        <w:numPr>
+          <w:ilvl w:val="0"/>
+          <w:numId w:val="14"/>
+        </w:numPr>
+        <w:rPr>
+          <w:sz w:val="20"/>
+          <w:szCs w:val="20"/>
+          <w:lang w:val="pt-PT"/>
+        </w:rPr>
+      </w:pPr>
+      <w:r>
+        <w:rPr>
+          <w:sz w:val="20"/>
+          <w:szCs w:val="20"/>
+          <w:lang w:val="pt-PT"/>
+        </w:rPr>
+        <w:t>Cidadania Ativa: Sugestões, eventos, Hall da Fama.</w:t>
+      </w:r>
+    </w:p>
+    <w:p>
+      <w:pPr>
+        <w:numPr>
+          <w:ilvl w:val="0"/>
+          <w:numId w:val="14"/>
+        </w:numPr>
+        <w:rPr>
+          <w:sz w:val="20"/>
+          <w:szCs w:val="20"/>
+          <w:lang w:val="pt-PT"/>
+        </w:rPr>
+      </w:pPr>
+      <w:r>
+        <w:rPr>
+          <w:sz w:val="20"/>
+          <w:szCs w:val="20"/>
+          <w:lang w:val="pt-PT"/>
+        </w:rPr>
+        <w:t xml:space="preserve">Acesso Público: Mapas interativos, </w:t>
+      </w:r>
+      <w:proofErr w:type="spellStart"/>
+      <w:r>
+        <w:rPr>
+          <w:sz w:val="20"/>
+          <w:szCs w:val="20"/>
+          <w:lang w:val="pt-PT"/>
+        </w:rPr>
+        <w:t>feed</w:t>
+      </w:r>
+      <w:proofErr w:type="spellEnd"/>
+      <w:r>
+        <w:rPr>
+          <w:sz w:val="20"/>
+          <w:szCs w:val="20"/>
+          <w:lang w:val="pt-PT"/>
+        </w:rPr>
+        <w:t xml:space="preserve"> de notícias.</w:t>
+      </w:r>
+    </w:p>
+    <w:p>
+      <w:pPr>
+        <w:numPr>
+          <w:ilvl w:val="0"/>
+          <w:numId w:val="14"/>
+        </w:numPr>
+        <w:rPr>
+          <w:sz w:val="20"/>
+          <w:szCs w:val="20"/>
+          <w:lang w:val="pt-PT"/>
+        </w:rPr>
+      </w:pPr>
+      <w:r>
+        <w:rPr>
+          <w:sz w:val="20"/>
+          <w:szCs w:val="20"/>
+          <w:lang w:val="pt-PT"/>
+        </w:rPr>
+        <w:t>Demo Rápida: Mostrar protótipo de mapa com uma zona de intervenção marcada.</w:t>
+      </w:r>
+    </w:p>
+    <w:p>
+      <w:pPr>
+        <w:rPr>
+          <w:b/>
+          <w:bCs/>
+          <w:sz w:val="20"/>
+          <w:szCs w:val="20"/>
+          <w:u w:val="single"/>
+          <w:lang w:val="pt-PT"/>
+        </w:rPr>
+      </w:pPr>
+      <w:r>
+        <w:rPr>
+          <w:b/>
+          <w:bCs/>
+          <w:sz w:val="20"/>
+          <w:szCs w:val="20"/>
+          <w:u w:val="single"/>
+          <w:lang w:val="pt-PT"/>
+        </w:rPr>
+        <w:t>Slide 5: Tecnologias Utilizadas</w:t>
+      </w:r>
+    </w:p>
+    <w:p>
+      <w:pPr>
+        <w:numPr>
+          <w:ilvl w:val="0"/>
+          <w:numId w:val="15"/>
+        </w:numPr>
+        <w:rPr>
+          <w:sz w:val="20"/>
+          <w:szCs w:val="20"/>
+        </w:rPr>
+      </w:pPr>
+      <w:r>
+        <w:rPr>
+          <w:sz w:val="20"/>
+          <w:szCs w:val="20"/>
+        </w:rPr>
+        <w:t>Frontend: Flutter (Mobile), React (Web).</w:t>
+      </w:r>
+    </w:p>
+    <w:p>
+      <w:pPr>
+        <w:numPr>
+          <w:ilvl w:val="0"/>
+          <w:numId w:val="15"/>
+        </w:numPr>
+        <w:rPr>
+          <w:sz w:val="20"/>
+          <w:szCs w:val="20"/>
+        </w:rPr>
+      </w:pPr>
+      <w:r>
+        <w:rPr>
+          <w:sz w:val="20"/>
+          <w:szCs w:val="20"/>
+        </w:rPr>
+        <w:t>Backend: Google Cloud (App Engine, Datastore).</w:t>
+      </w:r>
+    </w:p>
+    <w:p>
+      <w:pPr>
+        <w:numPr>
+          <w:ilvl w:val="0"/>
+          <w:numId w:val="15"/>
+        </w:numPr>
+        <w:rPr>
+          <w:sz w:val="20"/>
+          <w:szCs w:val="20"/>
+          <w:lang w:val="pt-PT"/>
+        </w:rPr>
+      </w:pPr>
+      <w:proofErr w:type="spellStart"/>
+      <w:r>
+        <w:rPr>
+          <w:sz w:val="20"/>
+          <w:szCs w:val="20"/>
+          <w:lang w:val="pt-PT"/>
+        </w:rPr>
+        <w:t>APIs</w:t>
+      </w:r>
+      <w:proofErr w:type="spellEnd"/>
+      <w:r>
+        <w:rPr>
+          <w:sz w:val="20"/>
+          <w:szCs w:val="20"/>
+          <w:lang w:val="pt-PT"/>
+        </w:rPr>
+        <w:t>: REST com autenticação JWT.</w:t>
+      </w:r>
+    </w:p>
+    <w:p>
+      <w:pPr>
+        <w:numPr>
+          <w:ilvl w:val="0"/>
+          <w:numId w:val="15"/>
+        </w:numPr>
+        <w:rPr>
+          <w:sz w:val="20"/>
+          <w:szCs w:val="20"/>
+          <w:lang w:val="pt-PT"/>
+        </w:rPr>
+      </w:pPr>
+      <w:r>
+        <w:rPr>
+          <w:sz w:val="20"/>
+          <w:szCs w:val="20"/>
+          <w:lang w:val="pt-PT"/>
+        </w:rPr>
+        <w:t xml:space="preserve">Integração com Google </w:t>
+      </w:r>
+      <w:proofErr w:type="spellStart"/>
+      <w:r>
+        <w:rPr>
+          <w:sz w:val="20"/>
+          <w:szCs w:val="20"/>
+          <w:lang w:val="pt-PT"/>
+        </w:rPr>
+        <w:t>Maps</w:t>
+      </w:r>
+      <w:proofErr w:type="spellEnd"/>
+      <w:r>
+        <w:rPr>
+          <w:sz w:val="20"/>
+          <w:szCs w:val="20"/>
+          <w:lang w:val="pt-PT"/>
+        </w:rPr>
+        <w:t xml:space="preserve"> API</w:t>
+      </w:r>
+    </w:p>
+    <w:p>
+      <w:pPr>
+        <w:rPr>
+          <w:b/>
+          <w:bCs/>
+          <w:sz w:val="20"/>
+          <w:szCs w:val="20"/>
+          <w:u w:val="single"/>
+          <w:lang w:val="pt-PT"/>
+        </w:rPr>
+      </w:pPr>
+      <w:r>
+        <w:rPr>
+          <w:b/>
+          <w:bCs/>
+          <w:sz w:val="20"/>
+          <w:szCs w:val="20"/>
+          <w:u w:val="single"/>
+          <w:lang w:val="pt-PT"/>
+        </w:rPr>
+        <w:t xml:space="preserve">Slide 6: Próximos Passos </w:t>
+      </w:r>
+    </w:p>
+    <w:p>
+      <w:pPr>
+        <w:numPr>
+          <w:ilvl w:val="0"/>
+          <w:numId w:val="16"/>
+        </w:numPr>
+        <w:rPr>
+          <w:sz w:val="20"/>
+          <w:szCs w:val="20"/>
+          <w:lang w:val="pt-PT"/>
+        </w:rPr>
+      </w:pPr>
+      <w:r>
+        <w:rPr>
+          <w:sz w:val="20"/>
+          <w:szCs w:val="20"/>
+          <w:lang w:val="pt-PT"/>
+        </w:rPr>
+        <w:t>Finalizar autenticação e controle de roles.</w:t>
+      </w:r>
+    </w:p>
+    <w:p>
+      <w:pPr>
+        <w:numPr>
+          <w:ilvl w:val="0"/>
+          <w:numId w:val="16"/>
+        </w:numPr>
+        <w:rPr>
+          <w:sz w:val="20"/>
+          <w:szCs w:val="20"/>
+          <w:lang w:val="pt-PT"/>
+        </w:rPr>
+      </w:pPr>
+      <w:r>
+        <w:rPr>
+          <w:sz w:val="20"/>
+          <w:szCs w:val="20"/>
+          <w:lang w:val="pt-PT"/>
+        </w:rPr>
+        <w:t xml:space="preserve">Implementar sistema de </w:t>
+      </w:r>
+      <w:r>
+        <w:rPr>
+          <w:sz w:val="20"/>
+          <w:szCs w:val="20"/>
+          <w:lang w:val="pt-PT"/>
+        </w:rPr>
+        <w:t xml:space="preserve">sugestão de intervenções e sistema de comentários </w:t>
+      </w:r>
+    </w:p>
+    <w:p>
+      <w:pPr>
+        <w:rPr>
+          <w:b/>
+          <w:bCs/>
+          <w:sz w:val="20"/>
+          <w:szCs w:val="20"/>
+          <w:u w:val="single"/>
+          <w:lang w:val="pt-PT"/>
+        </w:rPr>
+      </w:pPr>
+      <w:r>
+        <w:rPr>
+          <w:b/>
+          <w:bCs/>
+          <w:sz w:val="20"/>
+          <w:szCs w:val="20"/>
+          <w:u w:val="single"/>
+          <w:lang w:val="pt-PT"/>
+        </w:rPr>
+        <w:t xml:space="preserve">Slide </w:t>
+      </w:r>
+      <w:r>
+        <w:rPr>
+          <w:b/>
+          <w:bCs/>
+          <w:sz w:val="20"/>
+          <w:szCs w:val="20"/>
+          <w:u w:val="single"/>
+          <w:lang w:val="pt-PT"/>
+        </w:rPr>
+        <w:t>7</w:t>
+      </w:r>
+      <w:r>
+        <w:rPr>
+          <w:b/>
+          <w:bCs/>
+          <w:sz w:val="20"/>
+          <w:szCs w:val="20"/>
+          <w:u w:val="single"/>
+          <w:lang w:val="pt-PT"/>
+        </w:rPr>
+        <w:t xml:space="preserve">: </w:t>
+      </w:r>
+      <w:r>
+        <w:rPr>
+          <w:b/>
+          <w:bCs/>
+          <w:sz w:val="20"/>
+          <w:szCs w:val="20"/>
+          <w:u w:val="single"/>
+          <w:lang w:val="pt-PT"/>
+        </w:rPr>
+        <w:t>Conclusão</w:t>
+      </w:r>
+    </w:p>
+    <w:p>
+      <w:pPr>
+        <w:numPr>
+          <w:ilvl w:val="0"/>
+          <w:numId w:val="17"/>
+        </w:numPr>
+        <w:rPr>
+          <w:sz w:val="20"/>
+          <w:szCs w:val="20"/>
+          <w:lang w:val="pt-PT"/>
+        </w:rPr>
+      </w:pPr>
+      <w:r>
+        <w:rPr>
+          <w:sz w:val="20"/>
+          <w:szCs w:val="20"/>
+          <w:lang w:val="pt-PT"/>
+        </w:rPr>
+        <w:t>Mais uma frase (</w:t>
+      </w:r>
+      <w:proofErr w:type="spellStart"/>
+      <w:r>
+        <w:rPr>
+          <w:sz w:val="20"/>
+          <w:szCs w:val="20"/>
+          <w:lang w:val="pt-PT"/>
+        </w:rPr>
+        <w:t>ex</w:t>
+      </w:r>
+      <w:proofErr w:type="spellEnd"/>
+      <w:r>
+        <w:rPr>
+          <w:sz w:val="20"/>
+          <w:szCs w:val="20"/>
+          <w:lang w:val="pt-PT"/>
+        </w:rPr>
+        <w:t>:</w:t>
+      </w:r>
+      <w:r>
+        <w:rPr>
+          <w:sz w:val="20"/>
+          <w:szCs w:val="20"/>
+          <w:lang w:val="pt-PT"/>
+        </w:rPr>
+        <w:t>"Junte-se à revolução da gestão territorial!"</w:t>
+      </w:r>
+      <w:r>
+        <w:rPr>
+          <w:sz w:val="20"/>
+          <w:szCs w:val="20"/>
+          <w:lang w:val="pt-PT"/>
+        </w:rPr>
+        <w:t>)</w:t>
+      </w:r>
+    </w:p>
+    <w:p>
+      <w:pPr>
+        <w:numPr>
+          <w:ilvl w:val="0"/>
+          <w:numId w:val="17"/>
+        </w:numPr>
+        <w:rPr>
+          <w:sz w:val="20"/>
+          <w:szCs w:val="20"/>
+          <w:lang w:val="pt-PT"/>
+        </w:rPr>
+      </w:pPr>
+      <w:r>
+        <w:rPr>
+          <w:sz w:val="20"/>
+          <w:szCs w:val="20"/>
+          <w:lang w:val="pt-PT"/>
+        </w:rPr>
+        <w:t xml:space="preserve">Contato: Site provisório + QR </w:t>
+      </w:r>
+      <w:proofErr w:type="spellStart"/>
+      <w:r>
+        <w:rPr>
+          <w:sz w:val="20"/>
+          <w:szCs w:val="20"/>
+          <w:lang w:val="pt-PT"/>
+        </w:rPr>
+        <w:t>code</w:t>
+      </w:r>
+      <w:proofErr w:type="spellEnd"/>
+      <w:r>
+        <w:rPr>
+          <w:sz w:val="20"/>
+          <w:szCs w:val="20"/>
+          <w:lang w:val="pt-PT"/>
+        </w:rPr>
+        <w:t xml:space="preserve"> para acesso.</w:t>
+      </w:r>
+    </w:p>
+    <w:p>
+      <w:pPr>
+        <w:rPr>
+          <w:b/>
+          <w:bCs/>
+          <w:sz w:val="28"/>
+          <w:szCs w:val="28"/>
+          <w:u w:val="single"/>
+          <w:lang w:val="pt-PT"/>
+        </w:rPr>
+      </w:pPr>
+    </w:p>
     <w:sectPr>
       <w:pgSz w:w="12240" w:h="15840"/>
       <w:pgMar w:top="1440" w:right="567" w:bottom="1440" w:left="567" w:header="720" w:footer="720" w:gutter="0"/>
@@ -2935,6 +4407,1198 @@
       </w:pPr>
       <w:rPr>
         <w:rFonts w:ascii="Symbol" w:hAnsi="Symbol" w:hint="default"/>
+      </w:rPr>
+    </w:lvl>
+  </w:abstractNum>
+  <w:abstractNum w:abstractNumId="9" w15:restartNumberingAfterBreak="0">
+    <w:nsid w:val="068D79F5"/>
+    <w:multiLevelType w:val="multilevel"/>
+    <w:tmpl w:val="FFC83FCE"/>
+    <w:lvl w:ilvl="0">
+      <w:start w:val="1"/>
+      <w:numFmt w:val="bullet"/>
+      <w:lvlText w:val=""/>
+      <w:lvlJc w:val="left"/>
+      <w:pPr>
+        <w:tabs>
+          <w:tab w:val="num" w:pos="720"/>
+        </w:tabs>
+        <w:ind w:left="720" w:hanging="360"/>
+      </w:pPr>
+      <w:rPr>
+        <w:rFonts w:ascii="Symbol" w:hAnsi="Symbol" w:hint="default"/>
+        <w:sz w:val="20"/>
+      </w:rPr>
+    </w:lvl>
+    <w:lvl w:ilvl="1" w:tentative="1">
+      <w:start w:val="1"/>
+      <w:numFmt w:val="bullet"/>
+      <w:lvlText w:val="o"/>
+      <w:lvlJc w:val="left"/>
+      <w:pPr>
+        <w:tabs>
+          <w:tab w:val="num" w:pos="1440"/>
+        </w:tabs>
+        <w:ind w:left="1440" w:hanging="360"/>
+      </w:pPr>
+      <w:rPr>
+        <w:rFonts w:ascii="Courier New" w:hAnsi="Courier New" w:hint="default"/>
+        <w:sz w:val="20"/>
+      </w:rPr>
+    </w:lvl>
+    <w:lvl w:ilvl="2" w:tentative="1">
+      <w:start w:val="1"/>
+      <w:numFmt w:val="bullet"/>
+      <w:lvlText w:val=""/>
+      <w:lvlJc w:val="left"/>
+      <w:pPr>
+        <w:tabs>
+          <w:tab w:val="num" w:pos="2160"/>
+        </w:tabs>
+        <w:ind w:left="2160" w:hanging="360"/>
+      </w:pPr>
+      <w:rPr>
+        <w:rFonts w:ascii="Wingdings" w:hAnsi="Wingdings" w:hint="default"/>
+        <w:sz w:val="20"/>
+      </w:rPr>
+    </w:lvl>
+    <w:lvl w:ilvl="3" w:tentative="1">
+      <w:start w:val="1"/>
+      <w:numFmt w:val="bullet"/>
+      <w:lvlText w:val=""/>
+      <w:lvlJc w:val="left"/>
+      <w:pPr>
+        <w:tabs>
+          <w:tab w:val="num" w:pos="2880"/>
+        </w:tabs>
+        <w:ind w:left="2880" w:hanging="360"/>
+      </w:pPr>
+      <w:rPr>
+        <w:rFonts w:ascii="Wingdings" w:hAnsi="Wingdings" w:hint="default"/>
+        <w:sz w:val="20"/>
+      </w:rPr>
+    </w:lvl>
+    <w:lvl w:ilvl="4" w:tentative="1">
+      <w:start w:val="1"/>
+      <w:numFmt w:val="bullet"/>
+      <w:lvlText w:val=""/>
+      <w:lvlJc w:val="left"/>
+      <w:pPr>
+        <w:tabs>
+          <w:tab w:val="num" w:pos="3600"/>
+        </w:tabs>
+        <w:ind w:left="3600" w:hanging="360"/>
+      </w:pPr>
+      <w:rPr>
+        <w:rFonts w:ascii="Wingdings" w:hAnsi="Wingdings" w:hint="default"/>
+        <w:sz w:val="20"/>
+      </w:rPr>
+    </w:lvl>
+    <w:lvl w:ilvl="5" w:tentative="1">
+      <w:start w:val="1"/>
+      <w:numFmt w:val="bullet"/>
+      <w:lvlText w:val=""/>
+      <w:lvlJc w:val="left"/>
+      <w:pPr>
+        <w:tabs>
+          <w:tab w:val="num" w:pos="4320"/>
+        </w:tabs>
+        <w:ind w:left="4320" w:hanging="360"/>
+      </w:pPr>
+      <w:rPr>
+        <w:rFonts w:ascii="Wingdings" w:hAnsi="Wingdings" w:hint="default"/>
+        <w:sz w:val="20"/>
+      </w:rPr>
+    </w:lvl>
+    <w:lvl w:ilvl="6" w:tentative="1">
+      <w:start w:val="1"/>
+      <w:numFmt w:val="bullet"/>
+      <w:lvlText w:val=""/>
+      <w:lvlJc w:val="left"/>
+      <w:pPr>
+        <w:tabs>
+          <w:tab w:val="num" w:pos="5040"/>
+        </w:tabs>
+        <w:ind w:left="5040" w:hanging="360"/>
+      </w:pPr>
+      <w:rPr>
+        <w:rFonts w:ascii="Wingdings" w:hAnsi="Wingdings" w:hint="default"/>
+        <w:sz w:val="20"/>
+      </w:rPr>
+    </w:lvl>
+    <w:lvl w:ilvl="7" w:tentative="1">
+      <w:start w:val="1"/>
+      <w:numFmt w:val="bullet"/>
+      <w:lvlText w:val=""/>
+      <w:lvlJc w:val="left"/>
+      <w:pPr>
+        <w:tabs>
+          <w:tab w:val="num" w:pos="5760"/>
+        </w:tabs>
+        <w:ind w:left="5760" w:hanging="360"/>
+      </w:pPr>
+      <w:rPr>
+        <w:rFonts w:ascii="Wingdings" w:hAnsi="Wingdings" w:hint="default"/>
+        <w:sz w:val="20"/>
+      </w:rPr>
+    </w:lvl>
+    <w:lvl w:ilvl="8" w:tentative="1">
+      <w:start w:val="1"/>
+      <w:numFmt w:val="bullet"/>
+      <w:lvlText w:val=""/>
+      <w:lvlJc w:val="left"/>
+      <w:pPr>
+        <w:tabs>
+          <w:tab w:val="num" w:pos="6480"/>
+        </w:tabs>
+        <w:ind w:left="6480" w:hanging="360"/>
+      </w:pPr>
+      <w:rPr>
+        <w:rFonts w:ascii="Wingdings" w:hAnsi="Wingdings" w:hint="default"/>
+        <w:sz w:val="20"/>
+      </w:rPr>
+    </w:lvl>
+  </w:abstractNum>
+  <w:abstractNum w:abstractNumId="10" w15:restartNumberingAfterBreak="0">
+    <w:nsid w:val="1B6539EA"/>
+    <w:multiLevelType w:val="multilevel"/>
+    <w:tmpl w:val="FF761744"/>
+    <w:lvl w:ilvl="0">
+      <w:start w:val="1"/>
+      <w:numFmt w:val="bullet"/>
+      <w:lvlText w:val=""/>
+      <w:lvlJc w:val="left"/>
+      <w:pPr>
+        <w:tabs>
+          <w:tab w:val="num" w:pos="720"/>
+        </w:tabs>
+        <w:ind w:left="720" w:hanging="360"/>
+      </w:pPr>
+      <w:rPr>
+        <w:rFonts w:ascii="Symbol" w:hAnsi="Symbol" w:hint="default"/>
+        <w:sz w:val="20"/>
+      </w:rPr>
+    </w:lvl>
+    <w:lvl w:ilvl="1" w:tentative="1">
+      <w:start w:val="1"/>
+      <w:numFmt w:val="bullet"/>
+      <w:lvlText w:val="o"/>
+      <w:lvlJc w:val="left"/>
+      <w:pPr>
+        <w:tabs>
+          <w:tab w:val="num" w:pos="1440"/>
+        </w:tabs>
+        <w:ind w:left="1440" w:hanging="360"/>
+      </w:pPr>
+      <w:rPr>
+        <w:rFonts w:ascii="Courier New" w:hAnsi="Courier New" w:hint="default"/>
+        <w:sz w:val="20"/>
+      </w:rPr>
+    </w:lvl>
+    <w:lvl w:ilvl="2" w:tentative="1">
+      <w:start w:val="1"/>
+      <w:numFmt w:val="bullet"/>
+      <w:lvlText w:val=""/>
+      <w:lvlJc w:val="left"/>
+      <w:pPr>
+        <w:tabs>
+          <w:tab w:val="num" w:pos="2160"/>
+        </w:tabs>
+        <w:ind w:left="2160" w:hanging="360"/>
+      </w:pPr>
+      <w:rPr>
+        <w:rFonts w:ascii="Wingdings" w:hAnsi="Wingdings" w:hint="default"/>
+        <w:sz w:val="20"/>
+      </w:rPr>
+    </w:lvl>
+    <w:lvl w:ilvl="3" w:tentative="1">
+      <w:start w:val="1"/>
+      <w:numFmt w:val="bullet"/>
+      <w:lvlText w:val=""/>
+      <w:lvlJc w:val="left"/>
+      <w:pPr>
+        <w:tabs>
+          <w:tab w:val="num" w:pos="2880"/>
+        </w:tabs>
+        <w:ind w:left="2880" w:hanging="360"/>
+      </w:pPr>
+      <w:rPr>
+        <w:rFonts w:ascii="Wingdings" w:hAnsi="Wingdings" w:hint="default"/>
+        <w:sz w:val="20"/>
+      </w:rPr>
+    </w:lvl>
+    <w:lvl w:ilvl="4" w:tentative="1">
+      <w:start w:val="1"/>
+      <w:numFmt w:val="bullet"/>
+      <w:lvlText w:val=""/>
+      <w:lvlJc w:val="left"/>
+      <w:pPr>
+        <w:tabs>
+          <w:tab w:val="num" w:pos="3600"/>
+        </w:tabs>
+        <w:ind w:left="3600" w:hanging="360"/>
+      </w:pPr>
+      <w:rPr>
+        <w:rFonts w:ascii="Wingdings" w:hAnsi="Wingdings" w:hint="default"/>
+        <w:sz w:val="20"/>
+      </w:rPr>
+    </w:lvl>
+    <w:lvl w:ilvl="5" w:tentative="1">
+      <w:start w:val="1"/>
+      <w:numFmt w:val="bullet"/>
+      <w:lvlText w:val=""/>
+      <w:lvlJc w:val="left"/>
+      <w:pPr>
+        <w:tabs>
+          <w:tab w:val="num" w:pos="4320"/>
+        </w:tabs>
+        <w:ind w:left="4320" w:hanging="360"/>
+      </w:pPr>
+      <w:rPr>
+        <w:rFonts w:ascii="Wingdings" w:hAnsi="Wingdings" w:hint="default"/>
+        <w:sz w:val="20"/>
+      </w:rPr>
+    </w:lvl>
+    <w:lvl w:ilvl="6" w:tentative="1">
+      <w:start w:val="1"/>
+      <w:numFmt w:val="bullet"/>
+      <w:lvlText w:val=""/>
+      <w:lvlJc w:val="left"/>
+      <w:pPr>
+        <w:tabs>
+          <w:tab w:val="num" w:pos="5040"/>
+        </w:tabs>
+        <w:ind w:left="5040" w:hanging="360"/>
+      </w:pPr>
+      <w:rPr>
+        <w:rFonts w:ascii="Wingdings" w:hAnsi="Wingdings" w:hint="default"/>
+        <w:sz w:val="20"/>
+      </w:rPr>
+    </w:lvl>
+    <w:lvl w:ilvl="7" w:tentative="1">
+      <w:start w:val="1"/>
+      <w:numFmt w:val="bullet"/>
+      <w:lvlText w:val=""/>
+      <w:lvlJc w:val="left"/>
+      <w:pPr>
+        <w:tabs>
+          <w:tab w:val="num" w:pos="5760"/>
+        </w:tabs>
+        <w:ind w:left="5760" w:hanging="360"/>
+      </w:pPr>
+      <w:rPr>
+        <w:rFonts w:ascii="Wingdings" w:hAnsi="Wingdings" w:hint="default"/>
+        <w:sz w:val="20"/>
+      </w:rPr>
+    </w:lvl>
+    <w:lvl w:ilvl="8" w:tentative="1">
+      <w:start w:val="1"/>
+      <w:numFmt w:val="bullet"/>
+      <w:lvlText w:val=""/>
+      <w:lvlJc w:val="left"/>
+      <w:pPr>
+        <w:tabs>
+          <w:tab w:val="num" w:pos="6480"/>
+        </w:tabs>
+        <w:ind w:left="6480" w:hanging="360"/>
+      </w:pPr>
+      <w:rPr>
+        <w:rFonts w:ascii="Wingdings" w:hAnsi="Wingdings" w:hint="default"/>
+        <w:sz w:val="20"/>
+      </w:rPr>
+    </w:lvl>
+  </w:abstractNum>
+  <w:abstractNum w:abstractNumId="11" w15:restartNumberingAfterBreak="0">
+    <w:nsid w:val="30031072"/>
+    <w:multiLevelType w:val="multilevel"/>
+    <w:tmpl w:val="450C3EEA"/>
+    <w:lvl w:ilvl="0">
+      <w:start w:val="1"/>
+      <w:numFmt w:val="bullet"/>
+      <w:lvlText w:val=""/>
+      <w:lvlJc w:val="left"/>
+      <w:pPr>
+        <w:tabs>
+          <w:tab w:val="num" w:pos="720"/>
+        </w:tabs>
+        <w:ind w:left="720" w:hanging="360"/>
+      </w:pPr>
+      <w:rPr>
+        <w:rFonts w:ascii="Symbol" w:hAnsi="Symbol" w:hint="default"/>
+        <w:sz w:val="20"/>
+      </w:rPr>
+    </w:lvl>
+    <w:lvl w:ilvl="1" w:tentative="1">
+      <w:start w:val="1"/>
+      <w:numFmt w:val="bullet"/>
+      <w:lvlText w:val="o"/>
+      <w:lvlJc w:val="left"/>
+      <w:pPr>
+        <w:tabs>
+          <w:tab w:val="num" w:pos="1440"/>
+        </w:tabs>
+        <w:ind w:left="1440" w:hanging="360"/>
+      </w:pPr>
+      <w:rPr>
+        <w:rFonts w:ascii="Courier New" w:hAnsi="Courier New" w:hint="default"/>
+        <w:sz w:val="20"/>
+      </w:rPr>
+    </w:lvl>
+    <w:lvl w:ilvl="2" w:tentative="1">
+      <w:start w:val="1"/>
+      <w:numFmt w:val="bullet"/>
+      <w:lvlText w:val=""/>
+      <w:lvlJc w:val="left"/>
+      <w:pPr>
+        <w:tabs>
+          <w:tab w:val="num" w:pos="2160"/>
+        </w:tabs>
+        <w:ind w:left="2160" w:hanging="360"/>
+      </w:pPr>
+      <w:rPr>
+        <w:rFonts w:ascii="Wingdings" w:hAnsi="Wingdings" w:hint="default"/>
+        <w:sz w:val="20"/>
+      </w:rPr>
+    </w:lvl>
+    <w:lvl w:ilvl="3" w:tentative="1">
+      <w:start w:val="1"/>
+      <w:numFmt w:val="bullet"/>
+      <w:lvlText w:val=""/>
+      <w:lvlJc w:val="left"/>
+      <w:pPr>
+        <w:tabs>
+          <w:tab w:val="num" w:pos="2880"/>
+        </w:tabs>
+        <w:ind w:left="2880" w:hanging="360"/>
+      </w:pPr>
+      <w:rPr>
+        <w:rFonts w:ascii="Wingdings" w:hAnsi="Wingdings" w:hint="default"/>
+        <w:sz w:val="20"/>
+      </w:rPr>
+    </w:lvl>
+    <w:lvl w:ilvl="4" w:tentative="1">
+      <w:start w:val="1"/>
+      <w:numFmt w:val="bullet"/>
+      <w:lvlText w:val=""/>
+      <w:lvlJc w:val="left"/>
+      <w:pPr>
+        <w:tabs>
+          <w:tab w:val="num" w:pos="3600"/>
+        </w:tabs>
+        <w:ind w:left="3600" w:hanging="360"/>
+      </w:pPr>
+      <w:rPr>
+        <w:rFonts w:ascii="Wingdings" w:hAnsi="Wingdings" w:hint="default"/>
+        <w:sz w:val="20"/>
+      </w:rPr>
+    </w:lvl>
+    <w:lvl w:ilvl="5" w:tentative="1">
+      <w:start w:val="1"/>
+      <w:numFmt w:val="bullet"/>
+      <w:lvlText w:val=""/>
+      <w:lvlJc w:val="left"/>
+      <w:pPr>
+        <w:tabs>
+          <w:tab w:val="num" w:pos="4320"/>
+        </w:tabs>
+        <w:ind w:left="4320" w:hanging="360"/>
+      </w:pPr>
+      <w:rPr>
+        <w:rFonts w:ascii="Wingdings" w:hAnsi="Wingdings" w:hint="default"/>
+        <w:sz w:val="20"/>
+      </w:rPr>
+    </w:lvl>
+    <w:lvl w:ilvl="6" w:tentative="1">
+      <w:start w:val="1"/>
+      <w:numFmt w:val="bullet"/>
+      <w:lvlText w:val=""/>
+      <w:lvlJc w:val="left"/>
+      <w:pPr>
+        <w:tabs>
+          <w:tab w:val="num" w:pos="5040"/>
+        </w:tabs>
+        <w:ind w:left="5040" w:hanging="360"/>
+      </w:pPr>
+      <w:rPr>
+        <w:rFonts w:ascii="Wingdings" w:hAnsi="Wingdings" w:hint="default"/>
+        <w:sz w:val="20"/>
+      </w:rPr>
+    </w:lvl>
+    <w:lvl w:ilvl="7" w:tentative="1">
+      <w:start w:val="1"/>
+      <w:numFmt w:val="bullet"/>
+      <w:lvlText w:val=""/>
+      <w:lvlJc w:val="left"/>
+      <w:pPr>
+        <w:tabs>
+          <w:tab w:val="num" w:pos="5760"/>
+        </w:tabs>
+        <w:ind w:left="5760" w:hanging="360"/>
+      </w:pPr>
+      <w:rPr>
+        <w:rFonts w:ascii="Wingdings" w:hAnsi="Wingdings" w:hint="default"/>
+        <w:sz w:val="20"/>
+      </w:rPr>
+    </w:lvl>
+    <w:lvl w:ilvl="8" w:tentative="1">
+      <w:start w:val="1"/>
+      <w:numFmt w:val="bullet"/>
+      <w:lvlText w:val=""/>
+      <w:lvlJc w:val="left"/>
+      <w:pPr>
+        <w:tabs>
+          <w:tab w:val="num" w:pos="6480"/>
+        </w:tabs>
+        <w:ind w:left="6480" w:hanging="360"/>
+      </w:pPr>
+      <w:rPr>
+        <w:rFonts w:ascii="Wingdings" w:hAnsi="Wingdings" w:hint="default"/>
+        <w:sz w:val="20"/>
+      </w:rPr>
+    </w:lvl>
+  </w:abstractNum>
+  <w:abstractNum w:abstractNumId="12" w15:restartNumberingAfterBreak="0">
+    <w:nsid w:val="40D200DE"/>
+    <w:multiLevelType w:val="multilevel"/>
+    <w:tmpl w:val="02B0897A"/>
+    <w:lvl w:ilvl="0">
+      <w:start w:val="1"/>
+      <w:numFmt w:val="bullet"/>
+      <w:lvlText w:val=""/>
+      <w:lvlJc w:val="left"/>
+      <w:pPr>
+        <w:tabs>
+          <w:tab w:val="num" w:pos="720"/>
+        </w:tabs>
+        <w:ind w:left="720" w:hanging="360"/>
+      </w:pPr>
+      <w:rPr>
+        <w:rFonts w:ascii="Symbol" w:hAnsi="Symbol" w:hint="default"/>
+        <w:sz w:val="20"/>
+      </w:rPr>
+    </w:lvl>
+    <w:lvl w:ilvl="1" w:tentative="1">
+      <w:start w:val="1"/>
+      <w:numFmt w:val="bullet"/>
+      <w:lvlText w:val="o"/>
+      <w:lvlJc w:val="left"/>
+      <w:pPr>
+        <w:tabs>
+          <w:tab w:val="num" w:pos="1440"/>
+        </w:tabs>
+        <w:ind w:left="1440" w:hanging="360"/>
+      </w:pPr>
+      <w:rPr>
+        <w:rFonts w:ascii="Courier New" w:hAnsi="Courier New" w:hint="default"/>
+        <w:sz w:val="20"/>
+      </w:rPr>
+    </w:lvl>
+    <w:lvl w:ilvl="2" w:tentative="1">
+      <w:start w:val="1"/>
+      <w:numFmt w:val="bullet"/>
+      <w:lvlText w:val=""/>
+      <w:lvlJc w:val="left"/>
+      <w:pPr>
+        <w:tabs>
+          <w:tab w:val="num" w:pos="2160"/>
+        </w:tabs>
+        <w:ind w:left="2160" w:hanging="360"/>
+      </w:pPr>
+      <w:rPr>
+        <w:rFonts w:ascii="Wingdings" w:hAnsi="Wingdings" w:hint="default"/>
+        <w:sz w:val="20"/>
+      </w:rPr>
+    </w:lvl>
+    <w:lvl w:ilvl="3" w:tentative="1">
+      <w:start w:val="1"/>
+      <w:numFmt w:val="bullet"/>
+      <w:lvlText w:val=""/>
+      <w:lvlJc w:val="left"/>
+      <w:pPr>
+        <w:tabs>
+          <w:tab w:val="num" w:pos="2880"/>
+        </w:tabs>
+        <w:ind w:left="2880" w:hanging="360"/>
+      </w:pPr>
+      <w:rPr>
+        <w:rFonts w:ascii="Wingdings" w:hAnsi="Wingdings" w:hint="default"/>
+        <w:sz w:val="20"/>
+      </w:rPr>
+    </w:lvl>
+    <w:lvl w:ilvl="4" w:tentative="1">
+      <w:start w:val="1"/>
+      <w:numFmt w:val="bullet"/>
+      <w:lvlText w:val=""/>
+      <w:lvlJc w:val="left"/>
+      <w:pPr>
+        <w:tabs>
+          <w:tab w:val="num" w:pos="3600"/>
+        </w:tabs>
+        <w:ind w:left="3600" w:hanging="360"/>
+      </w:pPr>
+      <w:rPr>
+        <w:rFonts w:ascii="Wingdings" w:hAnsi="Wingdings" w:hint="default"/>
+        <w:sz w:val="20"/>
+      </w:rPr>
+    </w:lvl>
+    <w:lvl w:ilvl="5" w:tentative="1">
+      <w:start w:val="1"/>
+      <w:numFmt w:val="bullet"/>
+      <w:lvlText w:val=""/>
+      <w:lvlJc w:val="left"/>
+      <w:pPr>
+        <w:tabs>
+          <w:tab w:val="num" w:pos="4320"/>
+        </w:tabs>
+        <w:ind w:left="4320" w:hanging="360"/>
+      </w:pPr>
+      <w:rPr>
+        <w:rFonts w:ascii="Wingdings" w:hAnsi="Wingdings" w:hint="default"/>
+        <w:sz w:val="20"/>
+      </w:rPr>
+    </w:lvl>
+    <w:lvl w:ilvl="6" w:tentative="1">
+      <w:start w:val="1"/>
+      <w:numFmt w:val="bullet"/>
+      <w:lvlText w:val=""/>
+      <w:lvlJc w:val="left"/>
+      <w:pPr>
+        <w:tabs>
+          <w:tab w:val="num" w:pos="5040"/>
+        </w:tabs>
+        <w:ind w:left="5040" w:hanging="360"/>
+      </w:pPr>
+      <w:rPr>
+        <w:rFonts w:ascii="Wingdings" w:hAnsi="Wingdings" w:hint="default"/>
+        <w:sz w:val="20"/>
+      </w:rPr>
+    </w:lvl>
+    <w:lvl w:ilvl="7" w:tentative="1">
+      <w:start w:val="1"/>
+      <w:numFmt w:val="bullet"/>
+      <w:lvlText w:val=""/>
+      <w:lvlJc w:val="left"/>
+      <w:pPr>
+        <w:tabs>
+          <w:tab w:val="num" w:pos="5760"/>
+        </w:tabs>
+        <w:ind w:left="5760" w:hanging="360"/>
+      </w:pPr>
+      <w:rPr>
+        <w:rFonts w:ascii="Wingdings" w:hAnsi="Wingdings" w:hint="default"/>
+        <w:sz w:val="20"/>
+      </w:rPr>
+    </w:lvl>
+    <w:lvl w:ilvl="8" w:tentative="1">
+      <w:start w:val="1"/>
+      <w:numFmt w:val="bullet"/>
+      <w:lvlText w:val=""/>
+      <w:lvlJc w:val="left"/>
+      <w:pPr>
+        <w:tabs>
+          <w:tab w:val="num" w:pos="6480"/>
+        </w:tabs>
+        <w:ind w:left="6480" w:hanging="360"/>
+      </w:pPr>
+      <w:rPr>
+        <w:rFonts w:ascii="Wingdings" w:hAnsi="Wingdings" w:hint="default"/>
+        <w:sz w:val="20"/>
+      </w:rPr>
+    </w:lvl>
+  </w:abstractNum>
+  <w:abstractNum w:abstractNumId="13" w15:restartNumberingAfterBreak="0">
+    <w:nsid w:val="59420A6D"/>
+    <w:multiLevelType w:val="multilevel"/>
+    <w:tmpl w:val="5E8A42F4"/>
+    <w:lvl w:ilvl="0">
+      <w:start w:val="1"/>
+      <w:numFmt w:val="bullet"/>
+      <w:lvlText w:val=""/>
+      <w:lvlJc w:val="left"/>
+      <w:pPr>
+        <w:tabs>
+          <w:tab w:val="num" w:pos="720"/>
+        </w:tabs>
+        <w:ind w:left="720" w:hanging="360"/>
+      </w:pPr>
+      <w:rPr>
+        <w:rFonts w:ascii="Symbol" w:hAnsi="Symbol" w:hint="default"/>
+        <w:sz w:val="20"/>
+      </w:rPr>
+    </w:lvl>
+    <w:lvl w:ilvl="1">
+      <w:start w:val="1"/>
+      <w:numFmt w:val="bullet"/>
+      <w:lvlText w:val="o"/>
+      <w:lvlJc w:val="left"/>
+      <w:pPr>
+        <w:tabs>
+          <w:tab w:val="num" w:pos="1440"/>
+        </w:tabs>
+        <w:ind w:left="1440" w:hanging="360"/>
+      </w:pPr>
+      <w:rPr>
+        <w:rFonts w:ascii="Courier New" w:hAnsi="Courier New" w:hint="default"/>
+        <w:sz w:val="20"/>
+      </w:rPr>
+    </w:lvl>
+    <w:lvl w:ilvl="2" w:tentative="1">
+      <w:start w:val="1"/>
+      <w:numFmt w:val="bullet"/>
+      <w:lvlText w:val=""/>
+      <w:lvlJc w:val="left"/>
+      <w:pPr>
+        <w:tabs>
+          <w:tab w:val="num" w:pos="2160"/>
+        </w:tabs>
+        <w:ind w:left="2160" w:hanging="360"/>
+      </w:pPr>
+      <w:rPr>
+        <w:rFonts w:ascii="Wingdings" w:hAnsi="Wingdings" w:hint="default"/>
+        <w:sz w:val="20"/>
+      </w:rPr>
+    </w:lvl>
+    <w:lvl w:ilvl="3" w:tentative="1">
+      <w:start w:val="1"/>
+      <w:numFmt w:val="bullet"/>
+      <w:lvlText w:val=""/>
+      <w:lvlJc w:val="left"/>
+      <w:pPr>
+        <w:tabs>
+          <w:tab w:val="num" w:pos="2880"/>
+        </w:tabs>
+        <w:ind w:left="2880" w:hanging="360"/>
+      </w:pPr>
+      <w:rPr>
+        <w:rFonts w:ascii="Wingdings" w:hAnsi="Wingdings" w:hint="default"/>
+        <w:sz w:val="20"/>
+      </w:rPr>
+    </w:lvl>
+    <w:lvl w:ilvl="4" w:tentative="1">
+      <w:start w:val="1"/>
+      <w:numFmt w:val="bullet"/>
+      <w:lvlText w:val=""/>
+      <w:lvlJc w:val="left"/>
+      <w:pPr>
+        <w:tabs>
+          <w:tab w:val="num" w:pos="3600"/>
+        </w:tabs>
+        <w:ind w:left="3600" w:hanging="360"/>
+      </w:pPr>
+      <w:rPr>
+        <w:rFonts w:ascii="Wingdings" w:hAnsi="Wingdings" w:hint="default"/>
+        <w:sz w:val="20"/>
+      </w:rPr>
+    </w:lvl>
+    <w:lvl w:ilvl="5" w:tentative="1">
+      <w:start w:val="1"/>
+      <w:numFmt w:val="bullet"/>
+      <w:lvlText w:val=""/>
+      <w:lvlJc w:val="left"/>
+      <w:pPr>
+        <w:tabs>
+          <w:tab w:val="num" w:pos="4320"/>
+        </w:tabs>
+        <w:ind w:left="4320" w:hanging="360"/>
+      </w:pPr>
+      <w:rPr>
+        <w:rFonts w:ascii="Wingdings" w:hAnsi="Wingdings" w:hint="default"/>
+        <w:sz w:val="20"/>
+      </w:rPr>
+    </w:lvl>
+    <w:lvl w:ilvl="6" w:tentative="1">
+      <w:start w:val="1"/>
+      <w:numFmt w:val="bullet"/>
+      <w:lvlText w:val=""/>
+      <w:lvlJc w:val="left"/>
+      <w:pPr>
+        <w:tabs>
+          <w:tab w:val="num" w:pos="5040"/>
+        </w:tabs>
+        <w:ind w:left="5040" w:hanging="360"/>
+      </w:pPr>
+      <w:rPr>
+        <w:rFonts w:ascii="Wingdings" w:hAnsi="Wingdings" w:hint="default"/>
+        <w:sz w:val="20"/>
+      </w:rPr>
+    </w:lvl>
+    <w:lvl w:ilvl="7" w:tentative="1">
+      <w:start w:val="1"/>
+      <w:numFmt w:val="bullet"/>
+      <w:lvlText w:val=""/>
+      <w:lvlJc w:val="left"/>
+      <w:pPr>
+        <w:tabs>
+          <w:tab w:val="num" w:pos="5760"/>
+        </w:tabs>
+        <w:ind w:left="5760" w:hanging="360"/>
+      </w:pPr>
+      <w:rPr>
+        <w:rFonts w:ascii="Wingdings" w:hAnsi="Wingdings" w:hint="default"/>
+        <w:sz w:val="20"/>
+      </w:rPr>
+    </w:lvl>
+    <w:lvl w:ilvl="8" w:tentative="1">
+      <w:start w:val="1"/>
+      <w:numFmt w:val="bullet"/>
+      <w:lvlText w:val=""/>
+      <w:lvlJc w:val="left"/>
+      <w:pPr>
+        <w:tabs>
+          <w:tab w:val="num" w:pos="6480"/>
+        </w:tabs>
+        <w:ind w:left="6480" w:hanging="360"/>
+      </w:pPr>
+      <w:rPr>
+        <w:rFonts w:ascii="Wingdings" w:hAnsi="Wingdings" w:hint="default"/>
+        <w:sz w:val="20"/>
+      </w:rPr>
+    </w:lvl>
+  </w:abstractNum>
+  <w:abstractNum w:abstractNumId="14" w15:restartNumberingAfterBreak="0">
+    <w:nsid w:val="5F0B63DB"/>
+    <w:multiLevelType w:val="multilevel"/>
+    <w:tmpl w:val="10D4FF0E"/>
+    <w:lvl w:ilvl="0">
+      <w:start w:val="1"/>
+      <w:numFmt w:val="bullet"/>
+      <w:lvlText w:val=""/>
+      <w:lvlJc w:val="left"/>
+      <w:pPr>
+        <w:tabs>
+          <w:tab w:val="num" w:pos="720"/>
+        </w:tabs>
+        <w:ind w:left="720" w:hanging="360"/>
+      </w:pPr>
+      <w:rPr>
+        <w:rFonts w:ascii="Symbol" w:hAnsi="Symbol" w:hint="default"/>
+        <w:sz w:val="20"/>
+      </w:rPr>
+    </w:lvl>
+    <w:lvl w:ilvl="1" w:tentative="1">
+      <w:start w:val="1"/>
+      <w:numFmt w:val="bullet"/>
+      <w:lvlText w:val="o"/>
+      <w:lvlJc w:val="left"/>
+      <w:pPr>
+        <w:tabs>
+          <w:tab w:val="num" w:pos="1440"/>
+        </w:tabs>
+        <w:ind w:left="1440" w:hanging="360"/>
+      </w:pPr>
+      <w:rPr>
+        <w:rFonts w:ascii="Courier New" w:hAnsi="Courier New" w:hint="default"/>
+        <w:sz w:val="20"/>
+      </w:rPr>
+    </w:lvl>
+    <w:lvl w:ilvl="2" w:tentative="1">
+      <w:start w:val="1"/>
+      <w:numFmt w:val="bullet"/>
+      <w:lvlText w:val=""/>
+      <w:lvlJc w:val="left"/>
+      <w:pPr>
+        <w:tabs>
+          <w:tab w:val="num" w:pos="2160"/>
+        </w:tabs>
+        <w:ind w:left="2160" w:hanging="360"/>
+      </w:pPr>
+      <w:rPr>
+        <w:rFonts w:ascii="Wingdings" w:hAnsi="Wingdings" w:hint="default"/>
+        <w:sz w:val="20"/>
+      </w:rPr>
+    </w:lvl>
+    <w:lvl w:ilvl="3" w:tentative="1">
+      <w:start w:val="1"/>
+      <w:numFmt w:val="bullet"/>
+      <w:lvlText w:val=""/>
+      <w:lvlJc w:val="left"/>
+      <w:pPr>
+        <w:tabs>
+          <w:tab w:val="num" w:pos="2880"/>
+        </w:tabs>
+        <w:ind w:left="2880" w:hanging="360"/>
+      </w:pPr>
+      <w:rPr>
+        <w:rFonts w:ascii="Wingdings" w:hAnsi="Wingdings" w:hint="default"/>
+        <w:sz w:val="20"/>
+      </w:rPr>
+    </w:lvl>
+    <w:lvl w:ilvl="4" w:tentative="1">
+      <w:start w:val="1"/>
+      <w:numFmt w:val="bullet"/>
+      <w:lvlText w:val=""/>
+      <w:lvlJc w:val="left"/>
+      <w:pPr>
+        <w:tabs>
+          <w:tab w:val="num" w:pos="3600"/>
+        </w:tabs>
+        <w:ind w:left="3600" w:hanging="360"/>
+      </w:pPr>
+      <w:rPr>
+        <w:rFonts w:ascii="Wingdings" w:hAnsi="Wingdings" w:hint="default"/>
+        <w:sz w:val="20"/>
+      </w:rPr>
+    </w:lvl>
+    <w:lvl w:ilvl="5" w:tentative="1">
+      <w:start w:val="1"/>
+      <w:numFmt w:val="bullet"/>
+      <w:lvlText w:val=""/>
+      <w:lvlJc w:val="left"/>
+      <w:pPr>
+        <w:tabs>
+          <w:tab w:val="num" w:pos="4320"/>
+        </w:tabs>
+        <w:ind w:left="4320" w:hanging="360"/>
+      </w:pPr>
+      <w:rPr>
+        <w:rFonts w:ascii="Wingdings" w:hAnsi="Wingdings" w:hint="default"/>
+        <w:sz w:val="20"/>
+      </w:rPr>
+    </w:lvl>
+    <w:lvl w:ilvl="6" w:tentative="1">
+      <w:start w:val="1"/>
+      <w:numFmt w:val="bullet"/>
+      <w:lvlText w:val=""/>
+      <w:lvlJc w:val="left"/>
+      <w:pPr>
+        <w:tabs>
+          <w:tab w:val="num" w:pos="5040"/>
+        </w:tabs>
+        <w:ind w:left="5040" w:hanging="360"/>
+      </w:pPr>
+      <w:rPr>
+        <w:rFonts w:ascii="Wingdings" w:hAnsi="Wingdings" w:hint="default"/>
+        <w:sz w:val="20"/>
+      </w:rPr>
+    </w:lvl>
+    <w:lvl w:ilvl="7" w:tentative="1">
+      <w:start w:val="1"/>
+      <w:numFmt w:val="bullet"/>
+      <w:lvlText w:val=""/>
+      <w:lvlJc w:val="left"/>
+      <w:pPr>
+        <w:tabs>
+          <w:tab w:val="num" w:pos="5760"/>
+        </w:tabs>
+        <w:ind w:left="5760" w:hanging="360"/>
+      </w:pPr>
+      <w:rPr>
+        <w:rFonts w:ascii="Wingdings" w:hAnsi="Wingdings" w:hint="default"/>
+        <w:sz w:val="20"/>
+      </w:rPr>
+    </w:lvl>
+    <w:lvl w:ilvl="8" w:tentative="1">
+      <w:start w:val="1"/>
+      <w:numFmt w:val="bullet"/>
+      <w:lvlText w:val=""/>
+      <w:lvlJc w:val="left"/>
+      <w:pPr>
+        <w:tabs>
+          <w:tab w:val="num" w:pos="6480"/>
+        </w:tabs>
+        <w:ind w:left="6480" w:hanging="360"/>
+      </w:pPr>
+      <w:rPr>
+        <w:rFonts w:ascii="Wingdings" w:hAnsi="Wingdings" w:hint="default"/>
+        <w:sz w:val="20"/>
+      </w:rPr>
+    </w:lvl>
+  </w:abstractNum>
+  <w:abstractNum w:abstractNumId="15" w15:restartNumberingAfterBreak="0">
+    <w:nsid w:val="60311575"/>
+    <w:multiLevelType w:val="multilevel"/>
+    <w:tmpl w:val="A008EAE4"/>
+    <w:lvl w:ilvl="0">
+      <w:start w:val="1"/>
+      <w:numFmt w:val="bullet"/>
+      <w:lvlText w:val=""/>
+      <w:lvlJc w:val="left"/>
+      <w:pPr>
+        <w:tabs>
+          <w:tab w:val="num" w:pos="720"/>
+        </w:tabs>
+        <w:ind w:left="720" w:hanging="360"/>
+      </w:pPr>
+      <w:rPr>
+        <w:rFonts w:ascii="Symbol" w:hAnsi="Symbol" w:hint="default"/>
+        <w:sz w:val="20"/>
+      </w:rPr>
+    </w:lvl>
+    <w:lvl w:ilvl="1" w:tentative="1">
+      <w:start w:val="1"/>
+      <w:numFmt w:val="bullet"/>
+      <w:lvlText w:val="o"/>
+      <w:lvlJc w:val="left"/>
+      <w:pPr>
+        <w:tabs>
+          <w:tab w:val="num" w:pos="1440"/>
+        </w:tabs>
+        <w:ind w:left="1440" w:hanging="360"/>
+      </w:pPr>
+      <w:rPr>
+        <w:rFonts w:ascii="Courier New" w:hAnsi="Courier New" w:hint="default"/>
+        <w:sz w:val="20"/>
+      </w:rPr>
+    </w:lvl>
+    <w:lvl w:ilvl="2" w:tentative="1">
+      <w:start w:val="1"/>
+      <w:numFmt w:val="bullet"/>
+      <w:lvlText w:val=""/>
+      <w:lvlJc w:val="left"/>
+      <w:pPr>
+        <w:tabs>
+          <w:tab w:val="num" w:pos="2160"/>
+        </w:tabs>
+        <w:ind w:left="2160" w:hanging="360"/>
+      </w:pPr>
+      <w:rPr>
+        <w:rFonts w:ascii="Wingdings" w:hAnsi="Wingdings" w:hint="default"/>
+        <w:sz w:val="20"/>
+      </w:rPr>
+    </w:lvl>
+    <w:lvl w:ilvl="3" w:tentative="1">
+      <w:start w:val="1"/>
+      <w:numFmt w:val="bullet"/>
+      <w:lvlText w:val=""/>
+      <w:lvlJc w:val="left"/>
+      <w:pPr>
+        <w:tabs>
+          <w:tab w:val="num" w:pos="2880"/>
+        </w:tabs>
+        <w:ind w:left="2880" w:hanging="360"/>
+      </w:pPr>
+      <w:rPr>
+        <w:rFonts w:ascii="Wingdings" w:hAnsi="Wingdings" w:hint="default"/>
+        <w:sz w:val="20"/>
+      </w:rPr>
+    </w:lvl>
+    <w:lvl w:ilvl="4" w:tentative="1">
+      <w:start w:val="1"/>
+      <w:numFmt w:val="bullet"/>
+      <w:lvlText w:val=""/>
+      <w:lvlJc w:val="left"/>
+      <w:pPr>
+        <w:tabs>
+          <w:tab w:val="num" w:pos="3600"/>
+        </w:tabs>
+        <w:ind w:left="3600" w:hanging="360"/>
+      </w:pPr>
+      <w:rPr>
+        <w:rFonts w:ascii="Wingdings" w:hAnsi="Wingdings" w:hint="default"/>
+        <w:sz w:val="20"/>
+      </w:rPr>
+    </w:lvl>
+    <w:lvl w:ilvl="5" w:tentative="1">
+      <w:start w:val="1"/>
+      <w:numFmt w:val="bullet"/>
+      <w:lvlText w:val=""/>
+      <w:lvlJc w:val="left"/>
+      <w:pPr>
+        <w:tabs>
+          <w:tab w:val="num" w:pos="4320"/>
+        </w:tabs>
+        <w:ind w:left="4320" w:hanging="360"/>
+      </w:pPr>
+      <w:rPr>
+        <w:rFonts w:ascii="Wingdings" w:hAnsi="Wingdings" w:hint="default"/>
+        <w:sz w:val="20"/>
+      </w:rPr>
+    </w:lvl>
+    <w:lvl w:ilvl="6" w:tentative="1">
+      <w:start w:val="1"/>
+      <w:numFmt w:val="bullet"/>
+      <w:lvlText w:val=""/>
+      <w:lvlJc w:val="left"/>
+      <w:pPr>
+        <w:tabs>
+          <w:tab w:val="num" w:pos="5040"/>
+        </w:tabs>
+        <w:ind w:left="5040" w:hanging="360"/>
+      </w:pPr>
+      <w:rPr>
+        <w:rFonts w:ascii="Wingdings" w:hAnsi="Wingdings" w:hint="default"/>
+        <w:sz w:val="20"/>
+      </w:rPr>
+    </w:lvl>
+    <w:lvl w:ilvl="7" w:tentative="1">
+      <w:start w:val="1"/>
+      <w:numFmt w:val="bullet"/>
+      <w:lvlText w:val=""/>
+      <w:lvlJc w:val="left"/>
+      <w:pPr>
+        <w:tabs>
+          <w:tab w:val="num" w:pos="5760"/>
+        </w:tabs>
+        <w:ind w:left="5760" w:hanging="360"/>
+      </w:pPr>
+      <w:rPr>
+        <w:rFonts w:ascii="Wingdings" w:hAnsi="Wingdings" w:hint="default"/>
+        <w:sz w:val="20"/>
+      </w:rPr>
+    </w:lvl>
+    <w:lvl w:ilvl="8" w:tentative="1">
+      <w:start w:val="1"/>
+      <w:numFmt w:val="bullet"/>
+      <w:lvlText w:val=""/>
+      <w:lvlJc w:val="left"/>
+      <w:pPr>
+        <w:tabs>
+          <w:tab w:val="num" w:pos="6480"/>
+        </w:tabs>
+        <w:ind w:left="6480" w:hanging="360"/>
+      </w:pPr>
+      <w:rPr>
+        <w:rFonts w:ascii="Wingdings" w:hAnsi="Wingdings" w:hint="default"/>
+        <w:sz w:val="20"/>
+      </w:rPr>
+    </w:lvl>
+  </w:abstractNum>
+  <w:abstractNum w:abstractNumId="16" w15:restartNumberingAfterBreak="0">
+    <w:nsid w:val="68ED1336"/>
+    <w:multiLevelType w:val="multilevel"/>
+    <w:tmpl w:val="509CD4F6"/>
+    <w:lvl w:ilvl="0">
+      <w:start w:val="1"/>
+      <w:numFmt w:val="bullet"/>
+      <w:lvlText w:val=""/>
+      <w:lvlJc w:val="left"/>
+      <w:pPr>
+        <w:tabs>
+          <w:tab w:val="num" w:pos="720"/>
+        </w:tabs>
+        <w:ind w:left="720" w:hanging="360"/>
+      </w:pPr>
+      <w:rPr>
+        <w:rFonts w:ascii="Symbol" w:hAnsi="Symbol" w:hint="default"/>
+        <w:sz w:val="20"/>
+      </w:rPr>
+    </w:lvl>
+    <w:lvl w:ilvl="1" w:tentative="1">
+      <w:start w:val="1"/>
+      <w:numFmt w:val="bullet"/>
+      <w:lvlText w:val="o"/>
+      <w:lvlJc w:val="left"/>
+      <w:pPr>
+        <w:tabs>
+          <w:tab w:val="num" w:pos="1440"/>
+        </w:tabs>
+        <w:ind w:left="1440" w:hanging="360"/>
+      </w:pPr>
+      <w:rPr>
+        <w:rFonts w:ascii="Courier New" w:hAnsi="Courier New" w:hint="default"/>
+        <w:sz w:val="20"/>
+      </w:rPr>
+    </w:lvl>
+    <w:lvl w:ilvl="2" w:tentative="1">
+      <w:start w:val="1"/>
+      <w:numFmt w:val="bullet"/>
+      <w:lvlText w:val=""/>
+      <w:lvlJc w:val="left"/>
+      <w:pPr>
+        <w:tabs>
+          <w:tab w:val="num" w:pos="2160"/>
+        </w:tabs>
+        <w:ind w:left="2160" w:hanging="360"/>
+      </w:pPr>
+      <w:rPr>
+        <w:rFonts w:ascii="Wingdings" w:hAnsi="Wingdings" w:hint="default"/>
+        <w:sz w:val="20"/>
+      </w:rPr>
+    </w:lvl>
+    <w:lvl w:ilvl="3" w:tentative="1">
+      <w:start w:val="1"/>
+      <w:numFmt w:val="bullet"/>
+      <w:lvlText w:val=""/>
+      <w:lvlJc w:val="left"/>
+      <w:pPr>
+        <w:tabs>
+          <w:tab w:val="num" w:pos="2880"/>
+        </w:tabs>
+        <w:ind w:left="2880" w:hanging="360"/>
+      </w:pPr>
+      <w:rPr>
+        <w:rFonts w:ascii="Wingdings" w:hAnsi="Wingdings" w:hint="default"/>
+        <w:sz w:val="20"/>
+      </w:rPr>
+    </w:lvl>
+    <w:lvl w:ilvl="4" w:tentative="1">
+      <w:start w:val="1"/>
+      <w:numFmt w:val="bullet"/>
+      <w:lvlText w:val=""/>
+      <w:lvlJc w:val="left"/>
+      <w:pPr>
+        <w:tabs>
+          <w:tab w:val="num" w:pos="3600"/>
+        </w:tabs>
+        <w:ind w:left="3600" w:hanging="360"/>
+      </w:pPr>
+      <w:rPr>
+        <w:rFonts w:ascii="Wingdings" w:hAnsi="Wingdings" w:hint="default"/>
+        <w:sz w:val="20"/>
+      </w:rPr>
+    </w:lvl>
+    <w:lvl w:ilvl="5" w:tentative="1">
+      <w:start w:val="1"/>
+      <w:numFmt w:val="bullet"/>
+      <w:lvlText w:val=""/>
+      <w:lvlJc w:val="left"/>
+      <w:pPr>
+        <w:tabs>
+          <w:tab w:val="num" w:pos="4320"/>
+        </w:tabs>
+        <w:ind w:left="4320" w:hanging="360"/>
+      </w:pPr>
+      <w:rPr>
+        <w:rFonts w:ascii="Wingdings" w:hAnsi="Wingdings" w:hint="default"/>
+        <w:sz w:val="20"/>
+      </w:rPr>
+    </w:lvl>
+    <w:lvl w:ilvl="6" w:tentative="1">
+      <w:start w:val="1"/>
+      <w:numFmt w:val="bullet"/>
+      <w:lvlText w:val=""/>
+      <w:lvlJc w:val="left"/>
+      <w:pPr>
+        <w:tabs>
+          <w:tab w:val="num" w:pos="5040"/>
+        </w:tabs>
+        <w:ind w:left="5040" w:hanging="360"/>
+      </w:pPr>
+      <w:rPr>
+        <w:rFonts w:ascii="Wingdings" w:hAnsi="Wingdings" w:hint="default"/>
+        <w:sz w:val="20"/>
+      </w:rPr>
+    </w:lvl>
+    <w:lvl w:ilvl="7" w:tentative="1">
+      <w:start w:val="1"/>
+      <w:numFmt w:val="bullet"/>
+      <w:lvlText w:val=""/>
+      <w:lvlJc w:val="left"/>
+      <w:pPr>
+        <w:tabs>
+          <w:tab w:val="num" w:pos="5760"/>
+        </w:tabs>
+        <w:ind w:left="5760" w:hanging="360"/>
+      </w:pPr>
+      <w:rPr>
+        <w:rFonts w:ascii="Wingdings" w:hAnsi="Wingdings" w:hint="default"/>
+        <w:sz w:val="20"/>
+      </w:rPr>
+    </w:lvl>
+    <w:lvl w:ilvl="8" w:tentative="1">
+      <w:start w:val="1"/>
+      <w:numFmt w:val="bullet"/>
+      <w:lvlText w:val=""/>
+      <w:lvlJc w:val="left"/>
+      <w:pPr>
+        <w:tabs>
+          <w:tab w:val="num" w:pos="6480"/>
+        </w:tabs>
+        <w:ind w:left="6480" w:hanging="360"/>
+      </w:pPr>
+      <w:rPr>
+        <w:rFonts w:ascii="Wingdings" w:hAnsi="Wingdings" w:hint="default"/>
+        <w:sz w:val="20"/>
       </w:rPr>
     </w:lvl>
   </w:abstractNum>
@@ -2964,6 +5628,30 @@
   </w:num>
   <w:num w:numId="9" w16cid:durableId="1736469978">
     <w:abstractNumId w:val="0"/>
+  </w:num>
+  <w:num w:numId="10" w16cid:durableId="2079664181">
+    <w:abstractNumId w:val="13"/>
+  </w:num>
+  <w:num w:numId="11" w16cid:durableId="683098503">
+    <w:abstractNumId w:val="14"/>
+  </w:num>
+  <w:num w:numId="12" w16cid:durableId="92554896">
+    <w:abstractNumId w:val="11"/>
+  </w:num>
+  <w:num w:numId="13" w16cid:durableId="1853453835">
+    <w:abstractNumId w:val="15"/>
+  </w:num>
+  <w:num w:numId="14" w16cid:durableId="472633">
+    <w:abstractNumId w:val="10"/>
+  </w:num>
+  <w:num w:numId="15" w16cid:durableId="934364087">
+    <w:abstractNumId w:val="12"/>
+  </w:num>
+  <w:num w:numId="16" w16cid:durableId="434597977">
+    <w:abstractNumId w:val="9"/>
+  </w:num>
+  <w:num w:numId="17" w16cid:durableId="1013726009">
+    <w:abstractNumId w:val="16"/>
   </w:num>
 </w:numbering>
 </file>

</xml_diff>